<commit_message>
Deployed 27a9a8b with MkDocs version: 1.6.1
</commit_message>
<xml_diff>
--- a/Buch Bayrische Nächte/Kapiteleinleitungen/Fieldguide of the Wardens.docx
+++ b/Buch Bayrische Nächte/Kapiteleinleitungen/Fieldguide of the Wardens.docx
@@ -252,14 +252,25 @@
         </w:rPr>
         <w:t xml:space="preserve">Shell shock, a phenomenon first recorded and described during the Civil War in the United States and </w:t>
       </w:r>
-      <w:r>
-        <w:rPr>
-          <w:rFonts w:eastAsia="Calibri" w:cs="Calibri"/>
-          <w:i/>
-          <w:color w:val="000000"/>
-          <w:lang w:val="en-US"/>
-        </w:rPr>
-        <w:t xml:space="preserve">later on </w:t>
+      <w:proofErr w:type="gramStart"/>
+      <w:r>
+        <w:rPr>
+          <w:rFonts w:eastAsia="Calibri" w:cs="Calibri"/>
+          <w:i/>
+          <w:color w:val="000000"/>
+          <w:lang w:val="en-US"/>
+        </w:rPr>
+        <w:t>later on</w:t>
+      </w:r>
+      <w:proofErr w:type="gramEnd"/>
+      <w:r>
+        <w:rPr>
+          <w:rFonts w:eastAsia="Calibri" w:cs="Calibri"/>
+          <w:i/>
+          <w:color w:val="000000"/>
+          <w:lang w:val="en-US"/>
+        </w:rPr>
+        <w:t xml:space="preserve"> </w:t>
       </w:r>
       <w:r>
         <w:rPr>
@@ -288,14 +299,25 @@
         </w:rPr>
         <w:t xml:space="preserve">, is a mental health condition that is caused by witnessing extreme events in person, like accidents, </w:t>
       </w:r>
-      <w:r>
-        <w:rPr>
-          <w:rFonts w:eastAsia="Calibri" w:cs="Calibri"/>
-          <w:i/>
-          <w:color w:val="000000"/>
-          <w:lang w:val="en-US"/>
-        </w:rPr>
-        <w:t xml:space="preserve">close up </w:t>
+      <w:proofErr w:type="gramStart"/>
+      <w:r>
+        <w:rPr>
+          <w:rFonts w:eastAsia="Calibri" w:cs="Calibri"/>
+          <w:i/>
+          <w:color w:val="000000"/>
+          <w:lang w:val="en-US"/>
+        </w:rPr>
+        <w:t>close up</w:t>
+      </w:r>
+      <w:proofErr w:type="gramEnd"/>
+      <w:r>
+        <w:rPr>
+          <w:rFonts w:eastAsia="Calibri" w:cs="Calibri"/>
+          <w:i/>
+          <w:color w:val="000000"/>
+          <w:lang w:val="en-US"/>
+        </w:rPr>
+        <w:t xml:space="preserve"> </w:t>
       </w:r>
       <w:r>
         <w:rPr>
@@ -337,7 +359,21 @@
         <w:rPr>
           <w:lang w:val="en-US"/>
         </w:rPr>
-        <w:t>Science is dead, long life science</w:t>
+        <w:t xml:space="preserve">Science is dead, </w:t>
+      </w:r>
+      <w:proofErr w:type="gramStart"/>
+      <w:r>
+        <w:rPr>
+          <w:lang w:val="en-US"/>
+        </w:rPr>
+        <w:t>long life</w:t>
+      </w:r>
+      <w:proofErr w:type="gramEnd"/>
+      <w:r>
+        <w:rPr>
+          <w:lang w:val="en-US"/>
+        </w:rPr>
+        <w:t xml:space="preserve"> science</w:t>
       </w:r>
     </w:p>
     <w:bookmarkEnd w:id="1"/>
@@ -671,16 +707,7 @@
           <w:color w:val="000000"/>
           <w:lang w:val="en-US"/>
         </w:rPr>
-        <w:t xml:space="preserve">. In addition, no direct financing of the organocation is allowed, only </w:t>
-      </w:r>
-      <w:r>
-        <w:rPr>
-          <w:rFonts w:eastAsia="Calibri" w:cs="Calibri"/>
-          <w:i/>
-          <w:color w:val="000000"/>
-          <w:lang w:val="en-US"/>
-        </w:rPr>
-        <w:t>subsidiar</w:t>
+        <w:t>. In addition, no direct financing of the organocation is allowed, only subsidiar</w:t>
       </w:r>
       <w:r>
         <w:rPr>
@@ -704,50 +731,283 @@
     <w:p>
       <w:pPr>
         <w:pStyle w:val="berschrift2"/>
-      </w:pPr>
+        <w:rPr>
+          <w:lang w:val="en-US"/>
+        </w:rPr>
+      </w:pPr>
+      <w:r>
+        <w:rPr>
+          <w:lang w:val="en-US"/>
+        </w:rPr>
+        <w:t xml:space="preserve">Recruitment and </w:t>
+      </w:r>
       <w:proofErr w:type="spellStart"/>
       <w:r>
-        <w:t>Recruitment</w:t>
+        <w:rPr>
+          <w:lang w:val="en-US"/>
+        </w:rPr>
+        <w:t>ist</w:t>
       </w:r>
       <w:proofErr w:type="spellEnd"/>
       <w:r>
-        <w:t xml:space="preserve"> and ist </w:t>
+        <w:rPr>
+          <w:lang w:val="en-US"/>
+        </w:rPr>
+        <w:t xml:space="preserve"> fallacies</w:t>
+      </w:r>
+    </w:p>
+    <w:p>
+      <w:pPr>
+        <w:rPr>
+          <w:rFonts w:eastAsia="Calibri" w:cs="Calibri"/>
+          <w:i/>
+          <w:color w:val="000000"/>
+          <w:lang w:val="en-US"/>
+        </w:rPr>
+      </w:pPr>
+      <w:r>
+        <w:rPr>
+          <w:lang w:val="en-US"/>
+        </w:rPr>
+        <w:tab/>
+      </w:r>
+      <w:r>
+        <w:rPr>
+          <w:rFonts w:eastAsia="Calibri" w:cs="Calibri"/>
+          <w:i/>
+          <w:color w:val="000000"/>
+          <w:lang w:val="en-US"/>
+        </w:rPr>
+        <w:t>Not every witness to supernatural events is worthy of being a warden. Their psychological state withstanding, not everyone is able to give their former life to a cause grander than themselves.</w:t>
+      </w:r>
+      <w:r>
+        <w:rPr>
+          <w:rFonts w:eastAsia="Calibri" w:cs="Calibri"/>
+          <w:i/>
+          <w:color w:val="000000"/>
+          <w:lang w:val="en-US"/>
+        </w:rPr>
+        <w:t xml:space="preserve"> Ask your Souls, if they will be able to matter.</w:t>
+      </w:r>
+    </w:p>
+    <w:p>
+      <w:pPr>
+        <w:rPr>
+          <w:rFonts w:eastAsia="Calibri" w:cs="Calibri"/>
+          <w:i/>
+          <w:color w:val="000000"/>
+          <w:lang w:val="en-US"/>
+        </w:rPr>
+      </w:pPr>
+    </w:p>
+    <w:p>
+      <w:pPr>
+        <w:pStyle w:val="berschrift1"/>
+        <w:rPr>
+          <w:lang w:val="en-US"/>
+        </w:rPr>
+      </w:pPr>
+      <w:r>
+        <w:rPr>
+          <w:lang w:val="en-US"/>
+        </w:rPr>
+        <w:t>General Chapters</w:t>
+      </w:r>
+    </w:p>
+    <w:p>
+      <w:pPr>
+        <w:pStyle w:val="berschrift2"/>
+        <w:rPr>
+          <w:lang w:val="en-US"/>
+        </w:rPr>
+      </w:pPr>
+      <w:bookmarkStart w:id="2" w:name="_Hlk222650411"/>
+      <w:r>
+        <w:rPr>
+          <w:lang w:val="en-US"/>
+        </w:rPr>
+        <w:t>Guidelines on Survival</w:t>
+      </w:r>
+    </w:p>
+    <w:p>
+      <w:pPr>
+        <w:rPr>
+          <w:i/>
+          <w:iCs/>
+          <w:lang w:val="en-US"/>
+        </w:rPr>
+      </w:pPr>
+      <w:bookmarkStart w:id="3" w:name="_Hlk222650324"/>
+      <w:bookmarkEnd w:id="2"/>
+      <w:r>
+        <w:rPr>
+          <w:i/>
+          <w:iCs/>
+          <w:lang w:val="en-US"/>
+        </w:rPr>
+        <w:t>During combat guidelines should be followed in a prioritized order:</w:t>
+      </w:r>
+    </w:p>
+    <w:p>
+      <w:pPr>
+        <w:pStyle w:val="Listenabsatz"/>
+        <w:numPr>
+          <w:ilvl w:val="0"/>
+          <w:numId w:val="1"/>
+        </w:numPr>
+        <w:rPr>
+          <w:i/>
+          <w:iCs/>
+          <w:lang w:val="en-US"/>
+        </w:rPr>
+      </w:pPr>
+      <w:r>
+        <w:rPr>
+          <w:i/>
+          <w:iCs/>
+          <w:lang w:val="en-US"/>
+        </w:rPr>
+        <w:t>Self-protection</w:t>
+      </w:r>
+    </w:p>
+    <w:p>
+      <w:pPr>
+        <w:pStyle w:val="Listenabsatz"/>
+        <w:numPr>
+          <w:ilvl w:val="0"/>
+          <w:numId w:val="1"/>
+        </w:numPr>
+        <w:rPr>
+          <w:i/>
+          <w:iCs/>
+          <w:lang w:val="en-US"/>
+        </w:rPr>
+      </w:pPr>
+      <w:r>
+        <w:rPr>
+          <w:i/>
+          <w:iCs/>
+          <w:lang w:val="en-US"/>
+        </w:rPr>
+        <w:t>Protection of humans</w:t>
+      </w:r>
+    </w:p>
+    <w:p>
+      <w:pPr>
+        <w:pStyle w:val="Listenabsatz"/>
+        <w:numPr>
+          <w:ilvl w:val="0"/>
+          <w:numId w:val="1"/>
+        </w:numPr>
+        <w:rPr>
+          <w:i/>
+          <w:iCs/>
+          <w:lang w:val="en-US"/>
+        </w:rPr>
+      </w:pPr>
+      <w:r>
+        <w:rPr>
+          <w:i/>
+          <w:iCs/>
+          <w:lang w:val="en-US"/>
+        </w:rPr>
+        <w:t xml:space="preserve">Capturing </w:t>
       </w:r>
       <w:proofErr w:type="spellStart"/>
       <w:r>
-        <w:t>fallacies</w:t>
+        <w:rPr>
+          <w:i/>
+          <w:iCs/>
+          <w:lang w:val="en-US"/>
+        </w:rPr>
+        <w:t>unnaturals</w:t>
       </w:r>
       <w:proofErr w:type="spellEnd"/>
-    </w:p>
-    <w:p>
-      <w:pPr>
-        <w:rPr>
-          <w:i/>
-          <w:iCs/>
-          <w:lang w:val="en-US"/>
-        </w:rPr>
-      </w:pPr>
-      <w:r>
-        <w:tab/>
-      </w:r>
-      <w:r>
-        <w:rPr>
-          <w:rFonts w:eastAsia="Calibri" w:cs="Calibri"/>
-          <w:i/>
-          <w:color w:val="000000"/>
-          <w:lang w:val="en-US"/>
-        </w:rPr>
-        <w:t>Not every witness to supernatural events is worthy of being a warden. Their psychological state withstanding, not everyone is able to give their former life to a cause grander than themselves.</w:t>
-      </w:r>
-      <w:r>
-        <w:rPr>
-          <w:rFonts w:eastAsia="Calibri" w:cs="Calibri"/>
-          <w:i/>
-          <w:color w:val="000000"/>
-          <w:lang w:val="en-US"/>
-        </w:rPr>
-        <w:t xml:space="preserve"> Ask your Souls, if they will be able to matter.</w:t>
-      </w:r>
+      <w:r>
+        <w:rPr>
+          <w:i/>
+          <w:iCs/>
+          <w:lang w:val="en-US"/>
+        </w:rPr>
+        <w:t xml:space="preserve"> alive</w:t>
+      </w:r>
+    </w:p>
+    <w:p>
+      <w:pPr>
+        <w:pStyle w:val="Listenabsatz"/>
+        <w:numPr>
+          <w:ilvl w:val="0"/>
+          <w:numId w:val="1"/>
+        </w:numPr>
+        <w:rPr>
+          <w:i/>
+          <w:iCs/>
+          <w:lang w:val="en-US"/>
+        </w:rPr>
+      </w:pPr>
+      <w:r>
+        <w:rPr>
+          <w:i/>
+          <w:iCs/>
+          <w:lang w:val="en-US"/>
+        </w:rPr>
+        <w:t>Capturing enemy humans alive</w:t>
+      </w:r>
+    </w:p>
+    <w:p>
+      <w:pPr>
+        <w:rPr>
+          <w:i/>
+          <w:iCs/>
+          <w:lang w:val="en-US"/>
+        </w:rPr>
+      </w:pPr>
+      <w:r>
+        <w:rPr>
+          <w:i/>
+          <w:iCs/>
+          <w:lang w:val="en-US"/>
+        </w:rPr>
+        <w:lastRenderedPageBreak/>
+        <w:t xml:space="preserve">If any of the </w:t>
+      </w:r>
+      <w:proofErr w:type="gramStart"/>
+      <w:r>
+        <w:rPr>
+          <w:i/>
+          <w:iCs/>
+          <w:lang w:val="en-US"/>
+        </w:rPr>
+        <w:t>aforementioned steps</w:t>
+      </w:r>
+      <w:proofErr w:type="gramEnd"/>
+      <w:r>
+        <w:rPr>
+          <w:i/>
+          <w:iCs/>
+          <w:lang w:val="en-US"/>
+        </w:rPr>
+        <w:t xml:space="preserve"> </w:t>
+      </w:r>
+      <w:proofErr w:type="spellStart"/>
+      <w:r>
+        <w:rPr>
+          <w:i/>
+          <w:iCs/>
+          <w:lang w:val="en-US"/>
+        </w:rPr>
+        <w:t>can not</w:t>
+      </w:r>
+      <w:proofErr w:type="spellEnd"/>
+      <w:r>
+        <w:rPr>
+          <w:i/>
+          <w:iCs/>
+          <w:lang w:val="en-US"/>
+        </w:rPr>
+        <w:t xml:space="preserve"> be guaranteed, killing is authorized.</w:t>
+      </w:r>
+      <w:bookmarkEnd w:id="3"/>
     </w:p>
     <w:sectPr>
       <w:pgSz w:w="11906" w:h="16838"/>
@@ -757,6 +1017,100 @@
     </w:sectPr>
   </w:body>
 </w:document>
+</file>
+
+<file path=word/numbering.xml><?xml version="1.0" encoding="utf-8"?>
+<w:numbering xmlns:wpc="http://schemas.microsoft.com/office/word/2010/wordprocessingCanvas" xmlns:cx="http://schemas.microsoft.com/office/drawing/2014/chartex" xmlns:cx1="http://schemas.microsoft.com/office/drawing/2015/9/8/chartex" xmlns:cx2="http://schemas.microsoft.com/office/drawing/2015/10/21/chartex" xmlns:cx3="http://schemas.microsoft.com/office/drawing/2016/5/9/chartex" xmlns:cx4="http://schemas.microsoft.com/office/drawing/2016/5/10/chartex" xmlns:cx5="http://schemas.microsoft.com/office/drawing/2016/5/11/chartex" xmlns:cx6="http://schemas.microsoft.com/office/drawing/2016/5/12/chartex" xmlns:cx7="http://schemas.microsoft.com/office/drawing/2016/5/13/chartex" xmlns:cx8="http://schemas.microsoft.com/office/drawing/2016/5/14/chartex" xmlns:mc="http://schemas.openxmlformats.org/markup-compatibility/2006" xmlns:aink="http://schemas.microsoft.com/office/drawing/2016/ink" xmlns:am3d="http://schemas.microsoft.com/office/drawing/2017/model3d" xmlns:o="urn:schemas-microsoft-com:office:office" xmlns:oel="http://schemas.microsoft.com/office/2019/extlst" xmlns:r="http://schemas.openxmlformats.org/officeDocument/2006/relationships" xmlns:m="http://schemas.openxmlformats.org/officeDocument/2006/math" xmlns:v="urn:schemas-microsoft-com:vml" xmlns:wp14="http://schemas.microsoft.com/office/word/2010/wordprocessingDrawing" xmlns:wp="http://schemas.openxmlformats.org/drawingml/2006/wordprocessingDrawing" xmlns:w10="urn:schemas-microsoft-com:office:word" xmlns:w="http://schemas.openxmlformats.org/wordprocessingml/2006/main" xmlns:w14="http://schemas.microsoft.com/office/word/2010/wordml" xmlns:w15="http://schemas.microsoft.com/office/word/2012/wordml" xmlns:w16cex="http://schemas.microsoft.com/office/word/2018/wordml/cex" xmlns:w16cid="http://schemas.microsoft.com/office/word/2016/wordml/cid" xmlns:w16="http://schemas.microsoft.com/office/word/2018/wordml" xmlns:w16du="http://schemas.microsoft.com/office/word/2023/wordml/word16du" xmlns:w16sdtdh="http://schemas.microsoft.com/office/word/2020/wordml/sdtdatahash" xmlns:w16sdtfl="http://schemas.microsoft.com/office/word/2024/wordml/sdtformatlock" xmlns:w16se="http://schemas.microsoft.com/office/word/2015/wordml/symex" xmlns:wpg="http://schemas.microsoft.com/office/word/2010/wordprocessingGroup" xmlns:wpi="http://schemas.microsoft.com/office/word/2010/wordprocessingInk" xmlns:wne="http://schemas.microsoft.com/office/word/2006/wordml" xmlns:wps="http://schemas.microsoft.com/office/word/2010/wordprocessingShape" mc:Ignorable="w14 w15 w16se w16cid w16 w16cex w16sdtdh w16sdtfl w16du wp14">
+  <w:abstractNum w:abstractNumId="0" w15:restartNumberingAfterBreak="0">
+    <w:nsid w:val="3EA63342"/>
+    <w:multiLevelType w:val="hybridMultilevel"/>
+    <w:tmpl w:val="408E1B06"/>
+    <w:lvl w:ilvl="0" w:tplc="0407000F">
+      <w:start w:val="1"/>
+      <w:numFmt w:val="decimal"/>
+      <w:lvlText w:val="%1."/>
+      <w:lvlJc w:val="left"/>
+      <w:pPr>
+        <w:ind w:left="720" w:hanging="360"/>
+      </w:pPr>
+    </w:lvl>
+    <w:lvl w:ilvl="1" w:tplc="04070019" w:tentative="1">
+      <w:start w:val="1"/>
+      <w:numFmt w:val="lowerLetter"/>
+      <w:lvlText w:val="%2."/>
+      <w:lvlJc w:val="left"/>
+      <w:pPr>
+        <w:ind w:left="1440" w:hanging="360"/>
+      </w:pPr>
+    </w:lvl>
+    <w:lvl w:ilvl="2" w:tplc="0407001B" w:tentative="1">
+      <w:start w:val="1"/>
+      <w:numFmt w:val="lowerRoman"/>
+      <w:lvlText w:val="%3."/>
+      <w:lvlJc w:val="right"/>
+      <w:pPr>
+        <w:ind w:left="2160" w:hanging="180"/>
+      </w:pPr>
+    </w:lvl>
+    <w:lvl w:ilvl="3" w:tplc="0407000F" w:tentative="1">
+      <w:start w:val="1"/>
+      <w:numFmt w:val="decimal"/>
+      <w:lvlText w:val="%4."/>
+      <w:lvlJc w:val="left"/>
+      <w:pPr>
+        <w:ind w:left="2880" w:hanging="360"/>
+      </w:pPr>
+    </w:lvl>
+    <w:lvl w:ilvl="4" w:tplc="04070019" w:tentative="1">
+      <w:start w:val="1"/>
+      <w:numFmt w:val="lowerLetter"/>
+      <w:lvlText w:val="%5."/>
+      <w:lvlJc w:val="left"/>
+      <w:pPr>
+        <w:ind w:left="3600" w:hanging="360"/>
+      </w:pPr>
+    </w:lvl>
+    <w:lvl w:ilvl="5" w:tplc="0407001B" w:tentative="1">
+      <w:start w:val="1"/>
+      <w:numFmt w:val="lowerRoman"/>
+      <w:lvlText w:val="%6."/>
+      <w:lvlJc w:val="right"/>
+      <w:pPr>
+        <w:ind w:left="4320" w:hanging="180"/>
+      </w:pPr>
+    </w:lvl>
+    <w:lvl w:ilvl="6" w:tplc="0407000F" w:tentative="1">
+      <w:start w:val="1"/>
+      <w:numFmt w:val="decimal"/>
+      <w:lvlText w:val="%7."/>
+      <w:lvlJc w:val="left"/>
+      <w:pPr>
+        <w:ind w:left="5040" w:hanging="360"/>
+      </w:pPr>
+    </w:lvl>
+    <w:lvl w:ilvl="7" w:tplc="04070019" w:tentative="1">
+      <w:start w:val="1"/>
+      <w:numFmt w:val="lowerLetter"/>
+      <w:lvlText w:val="%8."/>
+      <w:lvlJc w:val="left"/>
+      <w:pPr>
+        <w:ind w:left="5760" w:hanging="360"/>
+      </w:pPr>
+    </w:lvl>
+    <w:lvl w:ilvl="8" w:tplc="0407001B" w:tentative="1">
+      <w:start w:val="1"/>
+      <w:numFmt w:val="lowerRoman"/>
+      <w:lvlText w:val="%9."/>
+      <w:lvlJc w:val="right"/>
+      <w:pPr>
+        <w:ind w:left="6480" w:hanging="180"/>
+      </w:pPr>
+    </w:lvl>
+  </w:abstractNum>
+  <w:num w:numId="1" w16cid:durableId="737172467">
+    <w:abstractNumId w:val="0"/>
+  </w:num>
+</w:numbering>
 </file>
 
 <file path=word/styles.xml><?xml version="1.0" encoding="utf-8"?>

</xml_diff>